<commit_message>
Expand and complete all SDLC documentation files in docx formats
</commit_message>
<xml_diff>
--- a/1.Brainstorming & Ideation/Brainstorming & Idea Prioritization.docx
+++ b/1.Brainstorming & Ideation/Brainstorming & Idea Prioritization.docx
@@ -15,25 +15,35 @@
         <w:pStyle w:val="Heading2"/>
       </w:pPr>
       <w:r>
-        <w:t>Project Title</w:t>
+        <w:t>1. Project Background</w:t>
       </w:r>
     </w:p>
     <w:p>
-      <w:r/>
       <w:r>
-        <w:rPr>
-          <w:b/>
-        </w:rPr>
-        <w:t>Predicting Human Development Index (HDI) Using Machine Learning</w:t>
+        <w:t>The Human Development Index (HDI) is a summary measure of average achievement in key dimensions of human development: a long and healthy life, being knowledgeable, and having a decent standard of living. Evaluating these factors is traditionally done retroactively by global institutions like the United Nations. However, governments, researchers, and NGOs need the ability to simulate and predict HDI scores based on current or hypothetical policy outcomes to enable proactive resource allocation and intervention design.</w:t>
       </w:r>
-      <w:r/>
+    </w:p>
+    <w:p>
+      <w:r>
+        <w:t>This project focuses on leveraging Machine Learning (specifically Linear Regression) to construct a prediction engine that takes development indicators as inputs, estimates the overall HDI score, maps it to the standard UNDP development tiers, and generates actionable, domain-specific recommendations.</w:t>
+      </w:r>
+    </w:p>
+    <w:p>
+      <w:r>
+        <w:t>---</w:t>
+      </w:r>
     </w:p>
     <w:p>
       <w:pPr>
         <w:pStyle w:val="Heading2"/>
       </w:pPr>
       <w:r>
-        <w:t>Team Brainstorming Session</w:t>
+        <w:t>2. Brainstorming Session</w:t>
+      </w:r>
+    </w:p>
+    <w:p>
+      <w:r>
+        <w:t>The project team conducted a structured brainstorming session to evaluate various approaches to solving the problem of human development evaluation and prediction. The goal was to build a solution that is technically feasible, has high real-world impact, utilizes available datasets, and can be developed within the timeline.</w:t>
       </w:r>
     </w:p>
     <w:p>
@@ -41,7 +51,316 @@
         <w:pStyle w:val="Heading3"/>
       </w:pPr>
       <w:r>
-        <w:t>Initial Ideas Generated</w:t>
+        <w:t>2.1 Ideas Generated</w:t>
+      </w:r>
+    </w:p>
+    <w:p>
+      <w:r>
+        <w:rPr>
+          <w:b/>
+          <w:sz w:val="22"/>
+        </w:rPr>
+        <w:t>Idea 1: Regression-Based HDI Score Predictor</w:t>
+      </w:r>
+    </w:p>
+    <w:p>
+      <w:pPr>
+        <w:pStyle w:val="ListBullet"/>
+      </w:pPr>
+      <w:r/>
+      <w:r>
+        <w:rPr>
+          <w:b/>
+        </w:rPr>
+        <w:t>Concept</w:t>
+      </w:r>
+      <w:r>
+        <w:t>: Train a regression model (e.g., Linear Regression, Ridge, or Lasso) on standard UNDP metrics (Life Expectancy, Expected Years of Schooling, Mean Years of Schooling, and GNI per Capita) to estimate the continuous HDI index value (ranging from 0.0 to 1.0).</w:t>
+      </w:r>
+    </w:p>
+    <w:p>
+      <w:pPr>
+        <w:pStyle w:val="ListBullet"/>
+      </w:pPr>
+      <w:r/>
+      <w:r>
+        <w:rPr>
+          <w:b/>
+        </w:rPr>
+        <w:t>Pros</w:t>
+      </w:r>
+      <w:r>
+        <w:t>: Highly interpretable, low computational requirements, directly fits the continuous nature of the index.</w:t>
+      </w:r>
+    </w:p>
+    <w:p>
+      <w:pPr>
+        <w:pStyle w:val="ListBullet"/>
+      </w:pPr>
+      <w:r/>
+      <w:r>
+        <w:rPr>
+          <w:b/>
+        </w:rPr>
+        <w:t>Cons</w:t>
+      </w:r>
+      <w:r>
+        <w:t>: Assumes linear relationships between features and target.</w:t>
+      </w:r>
+    </w:p>
+    <w:p>
+      <w:r>
+        <w:rPr>
+          <w:b/>
+          <w:sz w:val="22"/>
+        </w:rPr>
+        <w:t>Idea 2: Multi-Class Development Tier Classifier</w:t>
+      </w:r>
+    </w:p>
+    <w:p>
+      <w:pPr>
+        <w:pStyle w:val="ListBullet"/>
+      </w:pPr>
+      <w:r/>
+      <w:r>
+        <w:rPr>
+          <w:b/>
+        </w:rPr>
+        <w:t>Concept</w:t>
+      </w:r>
+      <w:r>
+        <w:t>: Discretize the target index into four distinct UNDP classes (Very High, High, Medium, Low) and train a classification algorithm (e.g., Random Forest, Support Vector Classifier, or KNN) to assign country profiles to tiers.</w:t>
+      </w:r>
+    </w:p>
+    <w:p>
+      <w:pPr>
+        <w:pStyle w:val="ListBullet"/>
+      </w:pPr>
+      <w:r/>
+      <w:r>
+        <w:rPr>
+          <w:b/>
+        </w:rPr>
+        <w:t>Pros</w:t>
+      </w:r>
+      <w:r>
+        <w:t>: Directly useful for categorizing development status.</w:t>
+      </w:r>
+    </w:p>
+    <w:p>
+      <w:pPr>
+        <w:pStyle w:val="ListBullet"/>
+      </w:pPr>
+      <w:r/>
+      <w:r>
+        <w:rPr>
+          <w:b/>
+        </w:rPr>
+        <w:t>Cons</w:t>
+      </w:r>
+      <w:r>
+        <w:t>: Information loss due to discretization; does not provide the precise continuous score.</w:t>
+      </w:r>
+    </w:p>
+    <w:p>
+      <w:r>
+        <w:rPr>
+          <w:b/>
+          <w:sz w:val="22"/>
+        </w:rPr>
+        <w:t>Idea 3: Policy Impact Simulator Dashboard</w:t>
+      </w:r>
+    </w:p>
+    <w:p>
+      <w:pPr>
+        <w:pStyle w:val="ListBullet"/>
+      </w:pPr>
+      <w:r/>
+      <w:r>
+        <w:rPr>
+          <w:b/>
+        </w:rPr>
+        <w:t>Concept</w:t>
+      </w:r>
+      <w:r>
+        <w:t>: An interactive dashboard containing sliders representing national development budgets (Healthcare, Primary/Secondary Education, Economic Subsidies) that maps financial inputs to predicted HDI changes using a multi-layered neural network.</w:t>
+      </w:r>
+    </w:p>
+    <w:p>
+      <w:pPr>
+        <w:pStyle w:val="ListBullet"/>
+      </w:pPr>
+      <w:r/>
+      <w:r>
+        <w:rPr>
+          <w:b/>
+        </w:rPr>
+        <w:t>Pros</w:t>
+      </w:r>
+      <w:r>
+        <w:t>: High visual and planning value for policymakers.</w:t>
+      </w:r>
+    </w:p>
+    <w:p>
+      <w:pPr>
+        <w:pStyle w:val="ListBullet"/>
+      </w:pPr>
+      <w:r/>
+      <w:r>
+        <w:rPr>
+          <w:b/>
+        </w:rPr>
+        <w:t>Cons</w:t>
+      </w:r>
+      <w:r>
+        <w:t>: Extremely high complexity, lack of reliable historical data mapping specific budgets directly to localized life expectancy or schooling outcomes.</w:t>
+      </w:r>
+    </w:p>
+    <w:p>
+      <w:r>
+        <w:rPr>
+          <w:b/>
+          <w:sz w:val="22"/>
+        </w:rPr>
+        <w:t>Idea 4: Regional HDI Trend Forecaster</w:t>
+      </w:r>
+    </w:p>
+    <w:p>
+      <w:pPr>
+        <w:pStyle w:val="ListBullet"/>
+      </w:pPr>
+      <w:r/>
+      <w:r>
+        <w:rPr>
+          <w:b/>
+        </w:rPr>
+        <w:t>Concept</w:t>
+      </w:r>
+      <w:r>
+        <w:t>: A time-series forecasting model (e.g., ARIMA or LSTM) trained on longitudinal UNDP data to predict how a country's HDI will change over the next 10 years based on historical trajectories.</w:t>
+      </w:r>
+    </w:p>
+    <w:p>
+      <w:pPr>
+        <w:pStyle w:val="ListBullet"/>
+      </w:pPr>
+      <w:r/>
+      <w:r>
+        <w:rPr>
+          <w:b/>
+        </w:rPr>
+        <w:t>Pros</w:t>
+      </w:r>
+      <w:r>
+        <w:t>: Helpful for long-term strategic forecasting.</w:t>
+      </w:r>
+    </w:p>
+    <w:p>
+      <w:pPr>
+        <w:pStyle w:val="ListBullet"/>
+      </w:pPr>
+      <w:r/>
+      <w:r>
+        <w:rPr>
+          <w:b/>
+        </w:rPr>
+        <w:t>Cons</w:t>
+      </w:r>
+      <w:r>
+        <w:t>: Does not allow users to simulate the direct impact of specific metric changes (e.g., if EYS increases by 2 years next year).</w:t>
+      </w:r>
+    </w:p>
+    <w:p>
+      <w:r>
+        <w:t>---</w:t>
+      </w:r>
+    </w:p>
+    <w:p>
+      <w:pPr>
+        <w:pStyle w:val="Heading2"/>
+      </w:pPr>
+      <w:r>
+        <w:t>3. Idea Prioritization Matrix</w:t>
+      </w:r>
+    </w:p>
+    <w:p>
+      <w:r>
+        <w:t>To select the optimal approach, the team scored each idea on a scale of 1 to 10 across five weighted criteria:</w:t>
+      </w:r>
+    </w:p>
+    <w:p>
+      <w:pPr>
+        <w:pStyle w:val="ListNumber"/>
+      </w:pPr>
+      <w:r/>
+      <w:r>
+        <w:rPr>
+          <w:b/>
+        </w:rPr>
+        <w:t>Technical Feasibility (30%)</w:t>
+      </w:r>
+      <w:r>
+        <w:t>: Ease of model training, validation, and deployment.</w:t>
+      </w:r>
+    </w:p>
+    <w:p>
+      <w:pPr>
+        <w:pStyle w:val="ListNumber"/>
+      </w:pPr>
+      <w:r/>
+      <w:r>
+        <w:rPr>
+          <w:b/>
+        </w:rPr>
+        <w:t>Business/Social Impact (25%)</w:t>
+      </w:r>
+      <w:r>
+        <w:t>: Practical utility for policymakers and analysts.</w:t>
+      </w:r>
+    </w:p>
+    <w:p>
+      <w:pPr>
+        <w:pStyle w:val="ListNumber"/>
+      </w:pPr>
+      <w:r/>
+      <w:r>
+        <w:rPr>
+          <w:b/>
+        </w:rPr>
+        <w:t>Data Availability (20%)</w:t>
+      </w:r>
+      <w:r>
+        <w:t>: Availability of high-quality training datasets.</w:t>
+      </w:r>
+    </w:p>
+    <w:p>
+      <w:pPr>
+        <w:pStyle w:val="ListNumber"/>
+      </w:pPr>
+      <w:r/>
+      <w:r>
+        <w:rPr>
+          <w:b/>
+        </w:rPr>
+        <w:t>Time to Implement (15%)</w:t>
+      </w:r>
+      <w:r>
+        <w:t>: Feasibility of developing a complete web solution in the given timeframe.</w:t>
+      </w:r>
+    </w:p>
+    <w:p>
+      <w:pPr>
+        <w:pStyle w:val="ListNumber"/>
+      </w:pPr>
+      <w:r/>
+      <w:r>
+        <w:rPr>
+          <w:b/>
+        </w:rPr>
+        <w:t>Scalability (10%)</w:t>
+      </w:r>
+      <w:r>
+        <w:t>: Potential for expanding feature sets and integrating advanced features.</w:t>
       </w:r>
     </w:p>
     <w:tbl>
@@ -51,16 +370,17 @@
         <w:tblLook w:firstColumn="1" w:firstRow="1" w:lastColumn="0" w:lastRow="0" w:noHBand="0" w:noVBand="1" w:val="04A0"/>
       </w:tblPr>
       <w:tblGrid>
-        <w:gridCol w:w="1728"/>
-        <w:gridCol w:w="1728"/>
-        <w:gridCol w:w="1728"/>
-        <w:gridCol w:w="1728"/>
-        <w:gridCol w:w="1728"/>
+        <w:gridCol w:w="1440"/>
+        <w:gridCol w:w="1440"/>
+        <w:gridCol w:w="1440"/>
+        <w:gridCol w:w="1440"/>
+        <w:gridCol w:w="1440"/>
+        <w:gridCol w:w="1440"/>
       </w:tblGrid>
       <w:tr>
         <w:tc>
           <w:tcPr>
-            <w:tcW w:type="dxa" w:w="1728"/>
+            <w:tcW w:type="dxa" w:w="1440"/>
             <w:shd w:fill="2563EB"/>
           </w:tcPr>
           <w:p>
@@ -69,384 +389,13 @@
                 <w:b/>
                 <w:color w:val="FFFFFF"/>
               </w:rPr>
-              <w:t>S.No</w:t>
+              <w:t>Evaluation Criteria</w:t>
             </w:r>
           </w:p>
         </w:tc>
         <w:tc>
           <w:tcPr>
-            <w:tcW w:type="dxa" w:w="1728"/>
-            <w:shd w:fill="2563EB"/>
-          </w:tcPr>
-          <w:p>
-            <w:r>
-              <w:rPr>
-                <w:b/>
-                <w:color w:val="FFFFFF"/>
-              </w:rPr>
-              <w:t>Idea</w:t>
-            </w:r>
-          </w:p>
-        </w:tc>
-        <w:tc>
-          <w:tcPr>
-            <w:tcW w:type="dxa" w:w="1728"/>
-            <w:shd w:fill="2563EB"/>
-          </w:tcPr>
-          <w:p>
-            <w:r>
-              <w:rPr>
-                <w:b/>
-                <w:color w:val="FFFFFF"/>
-              </w:rPr>
-              <w:t>Description</w:t>
-            </w:r>
-          </w:p>
-        </w:tc>
-        <w:tc>
-          <w:tcPr>
-            <w:tcW w:type="dxa" w:w="1728"/>
-            <w:shd w:fill="2563EB"/>
-          </w:tcPr>
-          <w:p>
-            <w:r>
-              <w:rPr>
-                <w:b/>
-                <w:color w:val="FFFFFF"/>
-              </w:rPr>
-              <w:t>Feasibility</w:t>
-            </w:r>
-          </w:p>
-        </w:tc>
-        <w:tc>
-          <w:tcPr>
-            <w:tcW w:type="dxa" w:w="1728"/>
-            <w:shd w:fill="2563EB"/>
-          </w:tcPr>
-          <w:p>
-            <w:r>
-              <w:rPr>
-                <w:b/>
-                <w:color w:val="FFFFFF"/>
-              </w:rPr>
-              <w:t>Impact</w:t>
-            </w:r>
-          </w:p>
-        </w:tc>
-      </w:tr>
-      <w:tr>
-        <w:tc>
-          <w:tcPr>
-            <w:tcW w:type="dxa" w:w="1728"/>
-          </w:tcPr>
-          <w:p>
-            <w:r>
-              <w:t>1</w:t>
-            </w:r>
-          </w:p>
-        </w:tc>
-        <w:tc>
-          <w:tcPr>
-            <w:tcW w:type="dxa" w:w="1728"/>
-          </w:tcPr>
-          <w:p>
-            <w:r>
-              <w:t>HDI Prediction using Linear Regression</w:t>
-            </w:r>
-          </w:p>
-        </w:tc>
-        <w:tc>
-          <w:tcPr>
-            <w:tcW w:type="dxa" w:w="1728"/>
-          </w:tcPr>
-          <w:p>
-            <w:r>
-              <w:t>Predict HDI scores based on life expectancy, education, and income indicators</w:t>
-            </w:r>
-          </w:p>
-        </w:tc>
-        <w:tc>
-          <w:tcPr>
-            <w:tcW w:type="dxa" w:w="1728"/>
-          </w:tcPr>
-          <w:p>
-            <w:r>
-              <w:t>High</w:t>
-            </w:r>
-          </w:p>
-        </w:tc>
-        <w:tc>
-          <w:tcPr>
-            <w:tcW w:type="dxa" w:w="1728"/>
-          </w:tcPr>
-          <w:p>
-            <w:r>
-              <w:t>High</w:t>
-            </w:r>
-          </w:p>
-        </w:tc>
-      </w:tr>
-      <w:tr>
-        <w:tc>
-          <w:tcPr>
-            <w:tcW w:type="dxa" w:w="1728"/>
-            <w:shd w:fill="F8FAFC"/>
-          </w:tcPr>
-          <w:p>
-            <w:r>
-              <w:t>2</w:t>
-            </w:r>
-          </w:p>
-        </w:tc>
-        <w:tc>
-          <w:tcPr>
-            <w:tcW w:type="dxa" w:w="1728"/>
-            <w:shd w:fill="F8FAFC"/>
-          </w:tcPr>
-          <w:p>
-            <w:r>
-              <w:t>Country Development Classifier</w:t>
-            </w:r>
-          </w:p>
-        </w:tc>
-        <w:tc>
-          <w:tcPr>
-            <w:tcW w:type="dxa" w:w="1728"/>
-            <w:shd w:fill="F8FAFC"/>
-          </w:tcPr>
-          <w:p>
-            <w:r>
-              <w:t>Classify countries into development tiers (Very High, High, Medium, Low)</w:t>
-            </w:r>
-          </w:p>
-        </w:tc>
-        <w:tc>
-          <w:tcPr>
-            <w:tcW w:type="dxa" w:w="1728"/>
-            <w:shd w:fill="F8FAFC"/>
-          </w:tcPr>
-          <w:p>
-            <w:r>
-              <w:t>High</w:t>
-            </w:r>
-          </w:p>
-        </w:tc>
-        <w:tc>
-          <w:tcPr>
-            <w:tcW w:type="dxa" w:w="1728"/>
-            <w:shd w:fill="F8FAFC"/>
-          </w:tcPr>
-          <w:p>
-            <w:r>
-              <w:t>High</w:t>
-            </w:r>
-          </w:p>
-        </w:tc>
-      </w:tr>
-      <w:tr>
-        <w:tc>
-          <w:tcPr>
-            <w:tcW w:type="dxa" w:w="1728"/>
-          </w:tcPr>
-          <w:p>
-            <w:r>
-              <w:t>3</w:t>
-            </w:r>
-          </w:p>
-        </w:tc>
-        <w:tc>
-          <w:tcPr>
-            <w:tcW w:type="dxa" w:w="1728"/>
-          </w:tcPr>
-          <w:p>
-            <w:r>
-              <w:t>HDI Trend Forecasting</w:t>
-            </w:r>
-          </w:p>
-        </w:tc>
-        <w:tc>
-          <w:tcPr>
-            <w:tcW w:type="dxa" w:w="1728"/>
-          </w:tcPr>
-          <w:p>
-            <w:r>
-              <w:t>Predict future HDI values based on historical trends</w:t>
-            </w:r>
-          </w:p>
-        </w:tc>
-        <w:tc>
-          <w:tcPr>
-            <w:tcW w:type="dxa" w:w="1728"/>
-          </w:tcPr>
-          <w:p>
-            <w:r>
-              <w:t>Medium</w:t>
-            </w:r>
-          </w:p>
-        </w:tc>
-        <w:tc>
-          <w:tcPr>
-            <w:tcW w:type="dxa" w:w="1728"/>
-          </w:tcPr>
-          <w:p>
-            <w:r>
-              <w:t>Medium</w:t>
-            </w:r>
-          </w:p>
-        </w:tc>
-      </w:tr>
-      <w:tr>
-        <w:tc>
-          <w:tcPr>
-            <w:tcW w:type="dxa" w:w="1728"/>
-            <w:shd w:fill="F8FAFC"/>
-          </w:tcPr>
-          <w:p>
-            <w:r>
-              <w:t>4</w:t>
-            </w:r>
-          </w:p>
-        </w:tc>
-        <w:tc>
-          <w:tcPr>
-            <w:tcW w:type="dxa" w:w="1728"/>
-            <w:shd w:fill="F8FAFC"/>
-          </w:tcPr>
-          <w:p>
-            <w:r>
-              <w:t>Policy Impact Simulator</w:t>
-            </w:r>
-          </w:p>
-        </w:tc>
-        <w:tc>
-          <w:tcPr>
-            <w:tcW w:type="dxa" w:w="1728"/>
-            <w:shd w:fill="F8FAFC"/>
-          </w:tcPr>
-          <w:p>
-            <w:r>
-              <w:t>Simulate how policy changes affect HDI outcomes</w:t>
-            </w:r>
-          </w:p>
-        </w:tc>
-        <w:tc>
-          <w:tcPr>
-            <w:tcW w:type="dxa" w:w="1728"/>
-            <w:shd w:fill="F8FAFC"/>
-          </w:tcPr>
-          <w:p>
-            <w:r>
-              <w:t>Low</w:t>
-            </w:r>
-          </w:p>
-        </w:tc>
-        <w:tc>
-          <w:tcPr>
-            <w:tcW w:type="dxa" w:w="1728"/>
-            <w:shd w:fill="F8FAFC"/>
-          </w:tcPr>
-          <w:p>
-            <w:r>
-              <w:t>High</w:t>
-            </w:r>
-          </w:p>
-        </w:tc>
-      </w:tr>
-      <w:tr>
-        <w:tc>
-          <w:tcPr>
-            <w:tcW w:type="dxa" w:w="1728"/>
-          </w:tcPr>
-          <w:p>
-            <w:r>
-              <w:t>5</w:t>
-            </w:r>
-          </w:p>
-        </w:tc>
-        <w:tc>
-          <w:tcPr>
-            <w:tcW w:type="dxa" w:w="1728"/>
-          </w:tcPr>
-          <w:p>
-            <w:r>
-              <w:t>Real-time HDI Dashboard</w:t>
-            </w:r>
-          </w:p>
-        </w:tc>
-        <w:tc>
-          <w:tcPr>
-            <w:tcW w:type="dxa" w:w="1728"/>
-          </w:tcPr>
-          <w:p>
-            <w:r>
-              <w:t>Live dashboard tracking HDI changes across countries</w:t>
-            </w:r>
-          </w:p>
-        </w:tc>
-        <w:tc>
-          <w:tcPr>
-            <w:tcW w:type="dxa" w:w="1728"/>
-          </w:tcPr>
-          <w:p>
-            <w:r>
-              <w:t>Medium</w:t>
-            </w:r>
-          </w:p>
-        </w:tc>
-        <w:tc>
-          <w:tcPr>
-            <w:tcW w:type="dxa" w:w="1728"/>
-          </w:tcPr>
-          <w:p>
-            <w:r>
-              <w:t>Medium</w:t>
-            </w:r>
-          </w:p>
-        </w:tc>
-      </w:tr>
-    </w:tbl>
-    <w:p>
-      <w:pPr>
-        <w:pStyle w:val="Heading3"/>
-      </w:pPr>
-      <w:r>
-        <w:t>Idea Prioritization Matrix</w:t>
-      </w:r>
-    </w:p>
-    <w:tbl>
-      <w:tblPr>
-        <w:tblStyle w:val="TableGrid"/>
-        <w:tblW w:type="auto" w:w="0"/>
-        <w:tblLook w:firstColumn="1" w:firstRow="1" w:lastColumn="0" w:lastRow="0" w:noHBand="0" w:noVBand="1" w:val="04A0"/>
-      </w:tblPr>
-      <w:tblGrid>
-        <w:gridCol w:w="1234"/>
-        <w:gridCol w:w="1234"/>
-        <w:gridCol w:w="1234"/>
-        <w:gridCol w:w="1234"/>
-        <w:gridCol w:w="1234"/>
-        <w:gridCol w:w="1234"/>
-        <w:gridCol w:w="1234"/>
-      </w:tblGrid>
-      <w:tr>
-        <w:tc>
-          <w:tcPr>
-            <w:tcW w:type="dxa" w:w="1234"/>
-            <w:shd w:fill="2563EB"/>
-          </w:tcPr>
-          <w:p>
-            <w:r>
-              <w:rPr>
-                <w:b/>
-                <w:color w:val="FFFFFF"/>
-              </w:rPr>
-              <w:t>Criteria</w:t>
-            </w:r>
-          </w:p>
-        </w:tc>
-        <w:tc>
-          <w:tcPr>
-            <w:tcW w:type="dxa" w:w="1234"/>
+            <w:tcW w:type="dxa" w:w="1440"/>
             <w:shd w:fill="2563EB"/>
           </w:tcPr>
           <w:p>
@@ -461,7 +410,7 @@
         </w:tc>
         <w:tc>
           <w:tcPr>
-            <w:tcW w:type="dxa" w:w="1234"/>
+            <w:tcW w:type="dxa" w:w="1440"/>
             <w:shd w:fill="2563EB"/>
           </w:tcPr>
           <w:p>
@@ -470,13 +419,13 @@
                 <w:b/>
                 <w:color w:val="FFFFFF"/>
               </w:rPr>
-              <w:t>Idea 1</w:t>
+              <w:t>Idea 1 (Regression)</w:t>
             </w:r>
           </w:p>
         </w:tc>
         <w:tc>
           <w:tcPr>
-            <w:tcW w:type="dxa" w:w="1234"/>
+            <w:tcW w:type="dxa" w:w="1440"/>
             <w:shd w:fill="2563EB"/>
           </w:tcPr>
           <w:p>
@@ -485,13 +434,13 @@
                 <w:b/>
                 <w:color w:val="FFFFFF"/>
               </w:rPr>
-              <w:t>Idea 2</w:t>
+              <w:t>Idea 2 (Classifier)</w:t>
             </w:r>
           </w:p>
         </w:tc>
         <w:tc>
           <w:tcPr>
-            <w:tcW w:type="dxa" w:w="1234"/>
+            <w:tcW w:type="dxa" w:w="1440"/>
             <w:shd w:fill="2563EB"/>
           </w:tcPr>
           <w:p>
@@ -500,13 +449,13 @@
                 <w:b/>
                 <w:color w:val="FFFFFF"/>
               </w:rPr>
-              <w:t>Idea 3</w:t>
+              <w:t>Idea 3 (Simulator)</w:t>
             </w:r>
           </w:p>
         </w:tc>
         <w:tc>
           <w:tcPr>
-            <w:tcW w:type="dxa" w:w="1234"/>
+            <w:tcW w:type="dxa" w:w="1440"/>
             <w:shd w:fill="2563EB"/>
           </w:tcPr>
           <w:p>
@@ -515,22 +464,7 @@
                 <w:b/>
                 <w:color w:val="FFFFFF"/>
               </w:rPr>
-              <w:t>Idea 4</w:t>
-            </w:r>
-          </w:p>
-        </w:tc>
-        <w:tc>
-          <w:tcPr>
-            <w:tcW w:type="dxa" w:w="1234"/>
-            <w:shd w:fill="2563EB"/>
-          </w:tcPr>
-          <w:p>
-            <w:r>
-              <w:rPr>
-                <w:b/>
-                <w:color w:val="FFFFFF"/>
-              </w:rPr>
-              <w:t>Idea 5</w:t>
+              <w:t>Idea 4 (Forecaster)</w:t>
             </w:r>
           </w:p>
         </w:tc>
@@ -538,7 +472,7 @@
       <w:tr>
         <w:tc>
           <w:tcPr>
-            <w:tcW w:type="dxa" w:w="1234"/>
+            <w:tcW w:type="dxa" w:w="1440"/>
           </w:tcPr>
           <w:p>
             <w:r>
@@ -548,7 +482,7 @@
         </w:tc>
         <w:tc>
           <w:tcPr>
-            <w:tcW w:type="dxa" w:w="1234"/>
+            <w:tcW w:type="dxa" w:w="1440"/>
           </w:tcPr>
           <w:p>
             <w:r>
@@ -558,17 +492,17 @@
         </w:tc>
         <w:tc>
           <w:tcPr>
-            <w:tcW w:type="dxa" w:w="1234"/>
+            <w:tcW w:type="dxa" w:w="1440"/>
           </w:tcPr>
           <w:p>
             <w:r>
-              <w:t>9</w:t>
+              <w:t>10</w:t>
             </w:r>
           </w:p>
         </w:tc>
         <w:tc>
           <w:tcPr>
-            <w:tcW w:type="dxa" w:w="1234"/>
+            <w:tcW w:type="dxa" w:w="1440"/>
           </w:tcPr>
           <w:p>
             <w:r>
@@ -578,17 +512,7 @@
         </w:tc>
         <w:tc>
           <w:tcPr>
-            <w:tcW w:type="dxa" w:w="1234"/>
-          </w:tcPr>
-          <w:p>
-            <w:r>
-              <w:t>6</w:t>
-            </w:r>
-          </w:p>
-        </w:tc>
-        <w:tc>
-          <w:tcPr>
-            <w:tcW w:type="dxa" w:w="1234"/>
+            <w:tcW w:type="dxa" w:w="1440"/>
           </w:tcPr>
           <w:p>
             <w:r>
@@ -598,7 +522,7 @@
         </w:tc>
         <w:tc>
           <w:tcPr>
-            <w:tcW w:type="dxa" w:w="1234"/>
+            <w:tcW w:type="dxa" w:w="1440"/>
           </w:tcPr>
           <w:p>
             <w:r>
@@ -610,18 +534,18 @@
       <w:tr>
         <w:tc>
           <w:tcPr>
-            <w:tcW w:type="dxa" w:w="1234"/>
+            <w:tcW w:type="dxa" w:w="1440"/>
             <w:shd w:fill="F8FAFC"/>
           </w:tcPr>
           <w:p>
             <w:r>
-              <w:t>Business Impact</w:t>
+              <w:t>Business/Social Impact</w:t>
             </w:r>
           </w:p>
         </w:tc>
         <w:tc>
           <w:tcPr>
-            <w:tcW w:type="dxa" w:w="1234"/>
+            <w:tcW w:type="dxa" w:w="1440"/>
             <w:shd w:fill="F8FAFC"/>
           </w:tcPr>
           <w:p>
@@ -632,7 +556,7 @@
         </w:tc>
         <w:tc>
           <w:tcPr>
-            <w:tcW w:type="dxa" w:w="1234"/>
+            <w:tcW w:type="dxa" w:w="1440"/>
             <w:shd w:fill="F8FAFC"/>
           </w:tcPr>
           <w:p>
@@ -643,18 +567,7 @@
         </w:tc>
         <w:tc>
           <w:tcPr>
-            <w:tcW w:type="dxa" w:w="1234"/>
-            <w:shd w:fill="F8FAFC"/>
-          </w:tcPr>
-          <w:p>
-            <w:r>
-              <w:t>9</w:t>
-            </w:r>
-          </w:p>
-        </w:tc>
-        <w:tc>
-          <w:tcPr>
-            <w:tcW w:type="dxa" w:w="1234"/>
+            <w:tcW w:type="dxa" w:w="1440"/>
             <w:shd w:fill="F8FAFC"/>
           </w:tcPr>
           <w:p>
@@ -665,8 +578,61 @@
         </w:tc>
         <w:tc>
           <w:tcPr>
-            <w:tcW w:type="dxa" w:w="1234"/>
+            <w:tcW w:type="dxa" w:w="1440"/>
             <w:shd w:fill="F8FAFC"/>
+          </w:tcPr>
+          <w:p>
+            <w:r>
+              <w:t>10</w:t>
+            </w:r>
+          </w:p>
+        </w:tc>
+        <w:tc>
+          <w:tcPr>
+            <w:tcW w:type="dxa" w:w="1440"/>
+            <w:shd w:fill="F8FAFC"/>
+          </w:tcPr>
+          <w:p>
+            <w:r>
+              <w:t>8</w:t>
+            </w:r>
+          </w:p>
+        </w:tc>
+      </w:tr>
+      <w:tr>
+        <w:tc>
+          <w:tcPr>
+            <w:tcW w:type="dxa" w:w="1440"/>
+          </w:tcPr>
+          <w:p>
+            <w:r>
+              <w:t>Data Availability</w:t>
+            </w:r>
+          </w:p>
+        </w:tc>
+        <w:tc>
+          <w:tcPr>
+            <w:tcW w:type="dxa" w:w="1440"/>
+          </w:tcPr>
+          <w:p>
+            <w:r>
+              <w:t>20%</w:t>
+            </w:r>
+          </w:p>
+        </w:tc>
+        <w:tc>
+          <w:tcPr>
+            <w:tcW w:type="dxa" w:w="1440"/>
+          </w:tcPr>
+          <w:p>
+            <w:r>
+              <w:t>10</w:t>
+            </w:r>
+          </w:p>
+        </w:tc>
+        <w:tc>
+          <w:tcPr>
+            <w:tcW w:type="dxa" w:w="1440"/>
           </w:tcPr>
           <w:p>
             <w:r>
@@ -676,80 +642,17 @@
         </w:tc>
         <w:tc>
           <w:tcPr>
-            <w:tcW w:type="dxa" w:w="1234"/>
-            <w:shd w:fill="F8FAFC"/>
+            <w:tcW w:type="dxa" w:w="1440"/>
           </w:tcPr>
           <w:p>
             <w:r>
-              <w:t>6</w:t>
-            </w:r>
-          </w:p>
-        </w:tc>
-      </w:tr>
-      <w:tr>
-        <w:tc>
-          <w:tcPr>
-            <w:tcW w:type="dxa" w:w="1234"/>
-          </w:tcPr>
-          <w:p>
-            <w:r>
-              <w:t>Data Availability</w:t>
+              <w:t>4</w:t>
             </w:r>
           </w:p>
         </w:tc>
         <w:tc>
           <w:tcPr>
-            <w:tcW w:type="dxa" w:w="1234"/>
-          </w:tcPr>
-          <w:p>
-            <w:r>
-              <w:t>20%</w:t>
-            </w:r>
-          </w:p>
-        </w:tc>
-        <w:tc>
-          <w:tcPr>
-            <w:tcW w:type="dxa" w:w="1234"/>
-          </w:tcPr>
-          <w:p>
-            <w:r>
-              <w:t>9</w:t>
-            </w:r>
-          </w:p>
-        </w:tc>
-        <w:tc>
-          <w:tcPr>
-            <w:tcW w:type="dxa" w:w="1234"/>
-          </w:tcPr>
-          <w:p>
-            <w:r>
-              <w:t>9</w:t>
-            </w:r>
-          </w:p>
-        </w:tc>
-        <w:tc>
-          <w:tcPr>
-            <w:tcW w:type="dxa" w:w="1234"/>
-          </w:tcPr>
-          <w:p>
-            <w:r>
-              <w:t>7</w:t>
-            </w:r>
-          </w:p>
-        </w:tc>
-        <w:tc>
-          <w:tcPr>
-            <w:tcW w:type="dxa" w:w="1234"/>
-          </w:tcPr>
-          <w:p>
-            <w:r>
-              <w:t>5</w:t>
-            </w:r>
-          </w:p>
-        </w:tc>
-        <w:tc>
-          <w:tcPr>
-            <w:tcW w:type="dxa" w:w="1234"/>
+            <w:tcW w:type="dxa" w:w="1440"/>
           </w:tcPr>
           <w:p>
             <w:r>
@@ -761,7 +664,7 @@
       <w:tr>
         <w:tc>
           <w:tcPr>
-            <w:tcW w:type="dxa" w:w="1234"/>
+            <w:tcW w:type="dxa" w:w="1440"/>
             <w:shd w:fill="F8FAFC"/>
           </w:tcPr>
           <w:p>
@@ -772,7 +675,7 @@
         </w:tc>
         <w:tc>
           <w:tcPr>
-            <w:tcW w:type="dxa" w:w="1234"/>
+            <w:tcW w:type="dxa" w:w="1440"/>
             <w:shd w:fill="F8FAFC"/>
           </w:tcPr>
           <w:p>
@@ -783,7 +686,7 @@
         </w:tc>
         <w:tc>
           <w:tcPr>
-            <w:tcW w:type="dxa" w:w="1234"/>
+            <w:tcW w:type="dxa" w:w="1440"/>
             <w:shd w:fill="F8FAFC"/>
           </w:tcPr>
           <w:p>
@@ -794,7 +697,7 @@
         </w:tc>
         <w:tc>
           <w:tcPr>
-            <w:tcW w:type="dxa" w:w="1234"/>
+            <w:tcW w:type="dxa" w:w="1440"/>
             <w:shd w:fill="F8FAFC"/>
           </w:tcPr>
           <w:p>
@@ -805,18 +708,7 @@
         </w:tc>
         <w:tc>
           <w:tcPr>
-            <w:tcW w:type="dxa" w:w="1234"/>
-            <w:shd w:fill="F8FAFC"/>
-          </w:tcPr>
-          <w:p>
-            <w:r>
-              <w:t>5</w:t>
-            </w:r>
-          </w:p>
-        </w:tc>
-        <w:tc>
-          <w:tcPr>
-            <w:tcW w:type="dxa" w:w="1234"/>
+            <w:tcW w:type="dxa" w:w="1440"/>
             <w:shd w:fill="F8FAFC"/>
           </w:tcPr>
           <w:p>
@@ -827,12 +719,12 @@
         </w:tc>
         <w:tc>
           <w:tcPr>
-            <w:tcW w:type="dxa" w:w="1234"/>
+            <w:tcW w:type="dxa" w:w="1440"/>
             <w:shd w:fill="F8FAFC"/>
           </w:tcPr>
           <w:p>
             <w:r>
-              <w:t>4</w:t>
+              <w:t>5</w:t>
             </w:r>
           </w:p>
         </w:tc>
@@ -840,7 +732,7 @@
       <w:tr>
         <w:tc>
           <w:tcPr>
-            <w:tcW w:type="dxa" w:w="1234"/>
+            <w:tcW w:type="dxa" w:w="1440"/>
           </w:tcPr>
           <w:p>
             <w:r>
@@ -850,7 +742,7 @@
         </w:tc>
         <w:tc>
           <w:tcPr>
-            <w:tcW w:type="dxa" w:w="1234"/>
+            <w:tcW w:type="dxa" w:w="1440"/>
           </w:tcPr>
           <w:p>
             <w:r>
@@ -860,17 +752,7 @@
         </w:tc>
         <w:tc>
           <w:tcPr>
-            <w:tcW w:type="dxa" w:w="1234"/>
-          </w:tcPr>
-          <w:p>
-            <w:r>
-              <w:t>7</w:t>
-            </w:r>
-          </w:p>
-        </w:tc>
-        <w:tc>
-          <w:tcPr>
-            <w:tcW w:type="dxa" w:w="1234"/>
+            <w:tcW w:type="dxa" w:w="1440"/>
           </w:tcPr>
           <w:p>
             <w:r>
@@ -880,27 +762,27 @@
         </w:tc>
         <w:tc>
           <w:tcPr>
-            <w:tcW w:type="dxa" w:w="1234"/>
+            <w:tcW w:type="dxa" w:w="1440"/>
           </w:tcPr>
           <w:p>
             <w:r>
-              <w:t>6</w:t>
+              <w:t>8</w:t>
             </w:r>
           </w:p>
         </w:tc>
         <w:tc>
           <w:tcPr>
-            <w:tcW w:type="dxa" w:w="1234"/>
+            <w:tcW w:type="dxa" w:w="1440"/>
           </w:tcPr>
           <w:p>
             <w:r>
-              <w:t>7</w:t>
+              <w:t>9</w:t>
             </w:r>
           </w:p>
         </w:tc>
         <w:tc>
           <w:tcPr>
-            <w:tcW w:type="dxa" w:w="1234"/>
+            <w:tcW w:type="dxa" w:w="1440"/>
           </w:tcPr>
           <w:p>
             <w:r>
@@ -912,7 +794,7 @@
       <w:tr>
         <w:tc>
           <w:tcPr>
-            <w:tcW w:type="dxa" w:w="1234"/>
+            <w:tcW w:type="dxa" w:w="1440"/>
             <w:shd w:fill="F8FAFC"/>
           </w:tcPr>
           <w:p>
@@ -923,7 +805,7 @@
         </w:tc>
         <w:tc>
           <w:tcPr>
-            <w:tcW w:type="dxa" w:w="1234"/>
+            <w:tcW w:type="dxa" w:w="1440"/>
             <w:shd w:fill="F8FAFC"/>
           </w:tcPr>
           <w:p>
@@ -934,56 +816,45 @@
         </w:tc>
         <w:tc>
           <w:tcPr>
-            <w:tcW w:type="dxa" w:w="1234"/>
+            <w:tcW w:type="dxa" w:w="1440"/>
             <w:shd w:fill="F8FAFC"/>
           </w:tcPr>
           <w:p>
             <w:r>
-              <w:t>**8.55**</w:t>
+              <w:t>**9.15**</w:t>
             </w:r>
           </w:p>
         </w:tc>
         <w:tc>
           <w:tcPr>
-            <w:tcW w:type="dxa" w:w="1234"/>
+            <w:tcW w:type="dxa" w:w="1440"/>
             <w:shd w:fill="F8FAFC"/>
           </w:tcPr>
           <w:p>
             <w:r>
-              <w:t>**8.55**</w:t>
+              <w:t>**8.05**</w:t>
             </w:r>
           </w:p>
         </w:tc>
         <w:tc>
           <w:tcPr>
-            <w:tcW w:type="dxa" w:w="1234"/>
+            <w:tcW w:type="dxa" w:w="1440"/>
             <w:shd w:fill="F8FAFC"/>
           </w:tcPr>
           <w:p>
             <w:r>
-              <w:t>**6.35**</w:t>
+              <w:t>**5.75**</w:t>
             </w:r>
           </w:p>
         </w:tc>
         <w:tc>
           <w:tcPr>
-            <w:tcW w:type="dxa" w:w="1234"/>
+            <w:tcW w:type="dxa" w:w="1440"/>
             <w:shd w:fill="F8FAFC"/>
           </w:tcPr>
           <w:p>
             <w:r>
-              <w:t>**5.40**</w:t>
-            </w:r>
-          </w:p>
-        </w:tc>
-        <w:tc>
-          <w:tcPr>
-            <w:tcW w:type="dxa" w:w="1234"/>
-            <w:shd w:fill="F8FAFC"/>
-          </w:tcPr>
-          <w:p>
-            <w:r>
-              <w:t>**5.75**</w:t>
+              <w:t>**6.45**</w:t>
             </w:r>
           </w:p>
         </w:tc>
@@ -994,67 +865,44 @@
         <w:pStyle w:val="Heading3"/>
       </w:pPr>
       <w:r>
-        <w:t>Selected Approach</w:t>
+        <w:t>Selected Implementation Approach</w:t>
       </w:r>
     </w:p>
     <w:p>
-      <w:r/>
+      <w:r>
+        <w:t xml:space="preserve">The team selected a </w:t>
+      </w:r>
       <w:r>
         <w:rPr>
           <w:b/>
         </w:rPr>
-        <w:t>Idea 1 + Idea 2 Combined</w:t>
+        <w:t>hybrid approach combining Idea 1 and Idea 2</w:t>
       </w:r>
       <w:r>
-        <w:t>: Build a machine learning web application that predicts HDI scores using Linear Regression and classifies countries into UNDP development tiers (Very High, High, Medium, Low) with contextual insights and policy recommendations.</w:t>
+        <w:t xml:space="preserve">. The core engine is a </w:t>
+      </w:r>
+      <w:r>
+        <w:rPr>
+          <w:b/>
+        </w:rPr>
+        <w:t>Linear Regression Predictor</w:t>
+      </w:r>
+      <w:r>
+        <w:t xml:space="preserve"> (Idea 1) that estimates the continuous HDI score. The application layer then automatically applies the standard UNDP classification thresholds to categorize the result into a </w:t>
+      </w:r>
+      <w:r>
+        <w:rPr>
+          <w:b/>
+        </w:rPr>
+        <w:t>Development Tier</w:t>
+      </w:r>
+      <w:r>
+        <w:t xml:space="preserve"> (Idea 2). This hybrid approach provides the precision of the continuous score while maintaining the high utility of tier-based categorization.</w:t>
       </w:r>
     </w:p>
     <w:p>
-      <w:pPr>
-        <w:pStyle w:val="Heading3"/>
-      </w:pPr>
       <w:r>
-        <w:t>Justification</w:t>
-      </w:r>
-    </w:p>
-    <w:p>
-      <w:pPr>
-        <w:pStyle w:val="ListBullet"/>
-      </w:pPr>
-      <w:r>
-        <w:t>High data availability from UNDP Human Development Reports</w:t>
-      </w:r>
-    </w:p>
-    <w:p>
-      <w:pPr>
-        <w:pStyle w:val="ListBullet"/>
-      </w:pPr>
-      <w:r>
-        <w:t>Linear Regression provides interpretable results for policy analysis</w:t>
-      </w:r>
-    </w:p>
-    <w:p>
-      <w:pPr>
-        <w:pStyle w:val="ListBullet"/>
-      </w:pPr>
-      <w:r>
-        <w:t>Flask web deployment enables accessible, interactive predictions</w:t>
-      </w:r>
-    </w:p>
-    <w:p>
-      <w:pPr>
-        <w:pStyle w:val="ListBullet"/>
-      </w:pPr>
-      <w:r>
-        <w:t>Tier classification adds practical value for policymakers and researchers</w:t>
-      </w:r>
-    </w:p>
-    <w:p>
-      <w:pPr>
-        <w:pStyle w:val="ListBullet"/>
-      </w:pPr>
-      <w:r>
-        <w:t>Clear input-output relationship makes the model easy to validate</w:t>
+        <w:t>---</w:t>
       </w:r>
     </w:p>
     <w:p>
@@ -1062,67 +910,52 @@
         <w:pStyle w:val="Heading2"/>
       </w:pPr>
       <w:r>
-        <w:t>Innovation Points</w:t>
+        <w:t>4. Innovation Points</w:t>
       </w:r>
     </w:p>
     <w:p>
       <w:pPr>
-        <w:pStyle w:val="ListNumber"/>
+        <w:pStyle w:val="ListBullet"/>
       </w:pPr>
       <w:r/>
       <w:r>
         <w:rPr>
           <w:b/>
         </w:rPr>
-        <w:t>Tier Classification</w:t>
+        <w:t>Actionable Insights Engine</w:t>
       </w:r>
       <w:r>
-        <w:t>: Beyond raw score prediction, classify into UNDP-standard tiers</w:t>
+        <w:t>: Instead of just outputting a raw number, the application maps the predicted tier to targeted developmental strategies (e.g., healthcare expansion, education reforms, income redistribution).</w:t>
       </w:r>
     </w:p>
     <w:p>
       <w:pPr>
-        <w:pStyle w:val="ListNumber"/>
+        <w:pStyle w:val="ListBullet"/>
       </w:pPr>
       <w:r/>
       <w:r>
         <w:rPr>
           <w:b/>
         </w:rPr>
-        <w:t>Contextual Insights</w:t>
+        <w:t>Interactive Progress Gauge</w:t>
       </w:r>
       <w:r>
-        <w:t>: Provide scenario-based recommendations for each development tier</w:t>
+        <w:t>: The interface visualizes the country's development level on a continuous gradient, making the raw numbers intuitive and visually engaging.</w:t>
       </w:r>
     </w:p>
     <w:p>
       <w:pPr>
-        <w:pStyle w:val="ListNumber"/>
+        <w:pStyle w:val="ListBullet"/>
       </w:pPr>
       <w:r/>
       <w:r>
         <w:rPr>
           <w:b/>
         </w:rPr>
-        <w:t>Interactive Visualization</w:t>
+        <w:t>Glassmorphic Design System</w:t>
       </w:r>
       <w:r>
-        <w:t>: HDI gauge bar and color-coded results for intuitive understanding</w:t>
-      </w:r>
-    </w:p>
-    <w:p>
-      <w:pPr>
-        <w:pStyle w:val="ListNumber"/>
-      </w:pPr>
-      <w:r/>
-      <w:r>
-        <w:rPr>
-          <w:b/>
-        </w:rPr>
-        <w:t>Multi-dimensional Analysis</w:t>
-      </w:r>
-      <w:r>
-        <w:t>: Consider health, education, and income simultaneously</w:t>
+        <w:t>: Uses a premium, modern dark mode dashboard to enhance visual engagement and user retention.</w:t>
       </w:r>
     </w:p>
     <w:sectPr>

</xml_diff>